<commit_message>
Tetapkan Applicant form ATEX GTS = PT LAPI Ganesha Utama
User konfirmasi Applicant = LGU (bukan PT Galaksi, yang tetap
Manufacturer). Field terkait di draf isian naik ke Tersedia; alamat
resmi/PIC/penandatangan LGU tetap ditandai belum ada karena memang
tidak tercatat di repo manapun.

Co-Authored-By: Claude Sonnet 5 <noreply@anthropic.com>
</commit_message>
<xml_diff>
--- a/Deliverables/Draf_Isian_Formulir_Aplikasi_ATEX_GTS_GLD.docx
+++ b/Deliverables/Draf_Isian_Formulir_Aplikasi_ATEX_GTS_GLD.docx
@@ -264,7 +264,7 @@
                 <w:b w:val="0"/>
                 <w:sz w:val="19"/>
               </w:rPr>
-              <w:t>Sebagian field masih “Perlu keputusan” — lihat highlight kuning/merah</w:t>
+              <w:t>Applicant sudah diputuskan (LGU). Sebagian field lain masih “Perlu keputusan”/data belum ada — lihat highlight</w:t>
             </w:r>
           </w:p>
         </w:tc>
@@ -288,7 +288,7 @@
         <w:tc>
           <w:tcPr>
             <w:tcW w:type="dxa" w:w="10200"/>
-            <w:shd w:val="clear" w:fill="FCEFDD"/>
+            <w:shd w:val="clear" w:fill="F3F6FC"/>
           </w:tcPr>
           <w:p>
             <w:pPr>
@@ -297,17 +297,17 @@
             <w:r>
               <w:rPr>
                 <w:b/>
-                <w:color w:val="B56A1E"/>
+                <w:color w:val="149174"/>
                 <w:sz w:val="19"/>
               </w:rPr>
-              <w:t xml:space="preserve">⚠ Keputusan diperlukan:  </w:t>
+              <w:t xml:space="preserve">✓ Diputuskan:  </w:t>
             </w:r>
             <w:r>
               <w:rPr>
-                <w:color w:val="B56A1E"/>
+                <w:color w:val="262321"/>
                 <w:sz w:val="19"/>
               </w:rPr>
-              <w:t>Formulir GTS memisahkan dua entitas: “Applicant” (pemohon/委托方) dan “Manufacturer” (制造商). Di dokumen sertifikasi kita, PT Galaksi Megatama Indonesia sudah ditetapkan sebagai Manufacturer dan LGU sebagai design and development authority (dec:130–131) — tapi SIAPA yang berperan sebagai “Applicant” pada formulir GTS ini (LGU, PT Galaksi, atau keduanya bersama) belum pernah diputuskan secara eksplisit. Ini bukan detail administratif kecil: menentukan siapa yang menandatangani &amp; bertanggung jawab hukum atas aplikasi sertifikasi.</w:t>
+              <w:t>Formulir GTS memisahkan dua entitas: “Applicant” (pemohon/委托方) dan “Manufacturer” (制造商). Dikonfirmasi user (23 Sep 2026): “Applicant” = PT LAPI Ganesha Utama (LGU) — konsisten dengan peran LGU sebagai design and development authority di dokumen sertifikasi (dec:130–131); PT Galaksi Megatama Indonesia tetap “Manufacturer”. Alamat resmi, PIC kontak, dan penandatangan LGU untuk pengajuan ini BELUM ada di berkas manapun di repo — masih perlu dilengkapi sebelum formulir bisa ditranskrip penuh.</w:t>
             </w:r>
           </w:p>
         </w:tc>
@@ -442,7 +442,7 @@
               <w:rPr>
                 <w:sz w:val="19"/>
               </w:rPr>
-              <w:t>Belum diputuskan (lihat catatan di atas)</w:t>
+              <w:t>PT LAPI Ganesha Utama (LGU)</w:t>
             </w:r>
           </w:p>
         </w:tc>
@@ -457,10 +457,10 @@
             <w:r>
               <w:rPr>
                 <w:b/>
-                <w:color w:val="B02A37"/>
+                <w:color w:val="149174"/>
                 <w:sz w:val="18"/>
               </w:rPr>
-              <w:t>Perlu keputusan</w:t>
+              <w:t>Tersedia</w:t>
             </w:r>
           </w:p>
         </w:tc>
@@ -499,7 +499,7 @@
               <w:rPr>
                 <w:sz w:val="19"/>
               </w:rPr>
-              <w:t>Belum diputuskan — menunggu kepastian entitas pemohon</w:t>
+              <w:t>Belum ada di berkas manapun — perlu alamat resmi terdaftar LGU</w:t>
             </w:r>
           </w:p>
         </w:tc>
@@ -784,7 +784,7 @@
               <w:rPr>
                 <w:sz w:val="19"/>
               </w:rPr>
-              <w:t>Belum ditentukan (opsi: sama dgn alamat Applicant / Manufacturer / lainnya)</w:t>
+              <w:t>Diasumsikan alamat LGU (Applicant) — sama seperti alamat Applicant di atas, cek ulang</w:t>
             </w:r>
           </w:p>
         </w:tc>
@@ -799,10 +799,10 @@
             <w:r>
               <w:rPr>
                 <w:b/>
-                <w:color w:val="B02A37"/>
+                <w:color w:val="B56A1E"/>
                 <w:sz w:val="18"/>
               </w:rPr>
-              <w:t>Perlu keputusan</w:t>
+              <w:t>Draf — cek ulang</w:t>
             </w:r>
           </w:p>
         </w:tc>
@@ -951,7 +951,7 @@
               <w:rPr>
                 <w:sz w:val="19"/>
               </w:rPr>
-              <w:t>= baris Applicant company name di atas (belum diputuskan)</w:t>
+              <w:t>PT LAPI Ganesha Utama (LGU)</w:t>
             </w:r>
           </w:p>
         </w:tc>
@@ -966,10 +966,10 @@
             <w:r>
               <w:rPr>
                 <w:b/>
-                <w:color w:val="B02A37"/>
+                <w:color w:val="149174"/>
                 <w:sz w:val="18"/>
               </w:rPr>
-              <w:t>Perlu keputusan</w:t>
+              <w:t>Tersedia</w:t>
             </w:r>
           </w:p>
         </w:tc>
@@ -1008,7 +1008,7 @@
               <w:rPr>
                 <w:sz w:val="19"/>
               </w:rPr>
-              <w:t>= baris Applicant company address di atas (belum diputuskan)</w:t>
+              <w:t>= baris Applicant company address di atas (belum ada data)</w:t>
             </w:r>
           </w:p>
         </w:tc>

</xml_diff>

<commit_message>
Isi alamat LGU dan PIC kontak (Dr. Maman Budiman) di draf form GTS
Alamat resmi LGU (Jl. Dederuk No.30, Sadang Serang, Bandung) dan data
kontak Dr. Maman Budiman (ITB, dari CV di repo terpisah) diisi ke
field Applicant address/Contact person/Position/Mobile/E-mail.
Authorized signatory (penandatangan hukum) sengaja tidak diisi
otomatis karena perannya berbeda dari PIC teknis -- tetap ditandai
perlu keputusan terpisah.

Co-Authored-By: Claude Sonnet 5 <noreply@anthropic.com>
</commit_message>
<xml_diff>
--- a/Deliverables/Draf_Isian_Formulir_Aplikasi_ATEX_GTS_GLD.docx
+++ b/Deliverables/Draf_Isian_Formulir_Aplikasi_ATEX_GTS_GLD.docx
@@ -264,7 +264,7 @@
                 <w:b w:val="0"/>
                 <w:sz w:val="19"/>
               </w:rPr>
-              <w:t>Applicant sudah diputuskan (LGU). Sebagian field lain masih “Perlu keputusan”/data belum ada — lihat highlight</w:t>
+              <w:t>Applicant, alamat LGU, dan PIC kontak (Dr. Maman Budiman) sudah terisi. Method of Protection, penandatangan resmi, dan Sample Return masih “Perlu keputusan” — lihat highlight</w:t>
             </w:r>
           </w:p>
         </w:tc>
@@ -307,7 +307,7 @@
                 <w:color w:val="262321"/>
                 <w:sz w:val="19"/>
               </w:rPr>
-              <w:t>Formulir GTS memisahkan dua entitas: “Applicant” (pemohon/委托方) dan “Manufacturer” (制造商). Dikonfirmasi user (23 Sep 2026): “Applicant” = PT LAPI Ganesha Utama (LGU) — konsisten dengan peran LGU sebagai design and development authority di dokumen sertifikasi (dec:130–131); PT Galaksi Megatama Indonesia tetap “Manufacturer”. Alamat resmi, PIC kontak, dan penandatangan LGU untuk pengajuan ini BELUM ada di berkas manapun di repo — masih perlu dilengkapi sebelum formulir bisa ditranskrip penuh.</w:t>
+              <w:t>Formulir GTS memisahkan dua entitas: “Applicant” (pemohon/委托方) dan “Manufacturer” (制造商). Dikonfirmasi user (23 Sep 2026): “Applicant” = PT LAPI Ganesha Utama (LGU) — konsisten dengan peran LGU sebagai design and development authority di dokumen sertifikasi (dec:130–131); PT Galaksi Megatama Indonesia tetap “Manufacturer”. Alamat resmi LGU (Jl. Dederuk No. 30, Sadang Serang, Bandung) dan PIC kontak (Dr. Maman Budiman, ITB — teknis/PIC proyek GLD) sudah dikonfirmasi user (25 Sep 2026). Penandatangan resmi aplikasi (authorized signatory) masih BELUM ditentukan — ini biasanya pejabat berwenang mewakili LGU secara hukum, bukan otomatis sama dengan PIC teknis/kontak korespondensi.</w:t>
             </w:r>
           </w:p>
         </w:tc>
@@ -499,7 +499,7 @@
               <w:rPr>
                 <w:sz w:val="19"/>
               </w:rPr>
-              <w:t>Belum ada di berkas manapun — perlu alamat resmi terdaftar LGU</w:t>
+              <w:t>Jl. Dederuk No. 30, Sadang Serang, Kecamatan Coblong, Kota Bandung, Jawa Barat 40133</w:t>
             </w:r>
           </w:p>
         </w:tc>
@@ -514,10 +514,10 @@
             <w:r>
               <w:rPr>
                 <w:b/>
-                <w:color w:val="B02A37"/>
+                <w:color w:val="149174"/>
                 <w:sz w:val="18"/>
               </w:rPr>
-              <w:t>Perlu keputusan</w:t>
+              <w:t>Tersedia</w:t>
             </w:r>
           </w:p>
         </w:tc>
@@ -556,7 +556,7 @@
               <w:rPr>
                 <w:sz w:val="19"/>
               </w:rPr>
-              <w:t>Belum ditentukan — lihat Formulir_Isian_Data_Dasar butir 3.3 (PIC proyek sertifikasi)</w:t>
+              <w:t>Dr. Maman Budiman</w:t>
             </w:r>
           </w:p>
         </w:tc>
@@ -571,10 +571,10 @@
             <w:r>
               <w:rPr>
                 <w:b/>
-                <w:color w:val="B02A37"/>
+                <w:color w:val="149174"/>
                 <w:sz w:val="18"/>
               </w:rPr>
-              <w:t>Perlu keputusan</w:t>
+              <w:t>Tersedia</w:t>
             </w:r>
           </w:p>
         </w:tc>
@@ -613,7 +613,7 @@
               <w:rPr>
                 <w:sz w:val="19"/>
               </w:rPr>
-              <w:t>Belum ditentukan</w:t>
+              <w:t>IoT Researcher &amp; Senior Lecturer, Instrumentation and Computation Physics Research Group, Institut Teknologi Bandung (ITB) — technical development partner; PIC proyek sertifikasi GLD</w:t>
             </w:r>
           </w:p>
         </w:tc>
@@ -628,10 +628,10 @@
             <w:r>
               <w:rPr>
                 <w:b/>
-                <w:color w:val="B02A37"/>
+                <w:color w:val="149174"/>
                 <w:sz w:val="18"/>
               </w:rPr>
-              <w:t>Perlu keputusan</w:t>
+              <w:t>Tersedia</w:t>
             </w:r>
           </w:p>
         </w:tc>
@@ -670,7 +670,7 @@
               <w:rPr>
                 <w:sz w:val="19"/>
               </w:rPr>
-              <w:t>Belum ditentukan</w:t>
+              <w:t>+62 812 2238 241</w:t>
             </w:r>
           </w:p>
         </w:tc>
@@ -685,10 +685,10 @@
             <w:r>
               <w:rPr>
                 <w:b/>
-                <w:color w:val="B02A37"/>
+                <w:color w:val="149174"/>
                 <w:sz w:val="18"/>
               </w:rPr>
-              <w:t>Perlu keputusan</w:t>
+              <w:t>Tersedia</w:t>
             </w:r>
           </w:p>
         </w:tc>
@@ -727,7 +727,7 @@
               <w:rPr>
                 <w:sz w:val="19"/>
               </w:rPr>
-              <w:t>Belum ditentukan</w:t>
+              <w:t>mamanbudiman@yahoo.com</w:t>
             </w:r>
           </w:p>
         </w:tc>
@@ -742,10 +742,10 @@
             <w:r>
               <w:rPr>
                 <w:b/>
-                <w:color w:val="B02A37"/>
+                <w:color w:val="149174"/>
                 <w:sz w:val="18"/>
               </w:rPr>
-              <w:t>Perlu keputusan</w:t>
+              <w:t>Tersedia</w:t>
             </w:r>
           </w:p>
         </w:tc>
@@ -784,7 +784,7 @@
               <w:rPr>
                 <w:sz w:val="19"/>
               </w:rPr>
-              <w:t>Diasumsikan alamat LGU (Applicant) — sama seperti alamat Applicant di atas, cek ulang</w:t>
+              <w:t>Sama dengan alamat Applicant di atas (Jl. Dederuk No. 30, Sadang Serang, Bandung 40133)</w:t>
             </w:r>
           </w:p>
         </w:tc>
@@ -799,10 +799,10 @@
             <w:r>
               <w:rPr>
                 <w:b/>
-                <w:color w:val="B56A1E"/>
+                <w:color w:val="149174"/>
                 <w:sz w:val="18"/>
               </w:rPr>
-              <w:t>Draf — cek ulang</w:t>
+              <w:t>Tersedia</w:t>
             </w:r>
           </w:p>
         </w:tc>
@@ -1008,7 +1008,7 @@
               <w:rPr>
                 <w:sz w:val="19"/>
               </w:rPr>
-              <w:t>= baris Applicant company address di atas (belum ada data)</w:t>
+              <w:t>Jl. Dederuk No. 30, Sadang Serang, Kecamatan Coblong, Kota Bandung, Jawa Barat 40133, Indonesia</w:t>
             </w:r>
           </w:p>
         </w:tc>
@@ -1023,10 +1023,10 @@
             <w:r>
               <w:rPr>
                 <w:b/>
-                <w:color w:val="B02A37"/>
+                <w:color w:val="149174"/>
                 <w:sz w:val="18"/>
               </w:rPr>
-              <w:t>Perlu keputusan</w:t>
+              <w:t>Tersedia</w:t>
             </w:r>
           </w:p>
         </w:tc>

</xml_diff>